<commit_message>
Use ML4H LaTeX as final paper source
</commit_message>
<xml_diff>
--- a/summary/Module_14_Summary_Sheet_Pruned_Evidence_Gate_Ravi_Bajaj.docx
+++ b/summary/Module_14_Summary_Sheet_Pruned_Evidence_Gate_Ravi_Bajaj.docx
@@ -74,13 +74,18 @@
             <w:pPr>
               <w:spacing w:after="0"/>
             </w:pPr>
-            <w:r/>
             <w:r>
               <w:rPr>
-                <w:rFonts w:ascii="Calibri" w:hAnsi="Calibri"/>
+                <w:rFonts w:ascii="Aptos" w:hAnsi="Aptos" w:eastAsia="Aptos"/>
+                <w:sz w:val="16"/>
+              </w:rPr>
+            </w:r>
+            <w:r>
+              <w:rPr>
+                <w:rFonts w:ascii="Aptos" w:hAnsi="Aptos" w:eastAsia="Aptos"/>
                 <w:b/>
                 <w:color w:val="000000"/>
-                <w:sz w:val="19"/>
+                <w:sz w:val="16"/>
               </w:rPr>
               <w:t>Field</w:t>
             </w:r>
@@ -96,13 +101,18 @@
             <w:pPr>
               <w:spacing w:after="0"/>
             </w:pPr>
-            <w:r/>
             <w:r>
               <w:rPr>
-                <w:rFonts w:ascii="Calibri" w:hAnsi="Calibri"/>
+                <w:rFonts w:ascii="Aptos" w:hAnsi="Aptos" w:eastAsia="Aptos"/>
+                <w:sz w:val="16"/>
+              </w:rPr>
+            </w:r>
+            <w:r>
+              <w:rPr>
+                <w:rFonts w:ascii="Aptos" w:hAnsi="Aptos" w:eastAsia="Aptos"/>
                 <w:b/>
                 <w:color w:val="000000"/>
-                <w:sz w:val="19"/>
+                <w:sz w:val="16"/>
               </w:rPr>
               <w:t>Value</w:t>
             </w:r>
@@ -119,13 +129,18 @@
             <w:pPr>
               <w:spacing w:after="0"/>
             </w:pPr>
-            <w:r/>
             <w:r>
               <w:rPr>
-                <w:rFonts w:ascii="Calibri" w:hAnsi="Calibri"/>
+                <w:rFonts w:ascii="Aptos" w:hAnsi="Aptos" w:eastAsia="Aptos"/>
+                <w:sz w:val="16"/>
+              </w:rPr>
+            </w:r>
+            <w:r>
+              <w:rPr>
+                <w:rFonts w:ascii="Aptos" w:hAnsi="Aptos" w:eastAsia="Aptos"/>
                 <w:b w:val="0"/>
                 <w:color w:val="000000"/>
-                <w:sz w:val="19"/>
+                <w:sz w:val="16"/>
               </w:rPr>
               <w:t>Name</w:t>
             </w:r>
@@ -140,13 +155,18 @@
             <w:pPr>
               <w:spacing w:after="0"/>
             </w:pPr>
-            <w:r/>
             <w:r>
               <w:rPr>
-                <w:rFonts w:ascii="Calibri" w:hAnsi="Calibri"/>
+                <w:rFonts w:ascii="Aptos" w:hAnsi="Aptos" w:eastAsia="Aptos"/>
+                <w:sz w:val="16"/>
+              </w:rPr>
+            </w:r>
+            <w:r>
+              <w:rPr>
+                <w:rFonts w:ascii="Aptos" w:hAnsi="Aptos" w:eastAsia="Aptos"/>
                 <w:b w:val="0"/>
                 <w:color w:val="000000"/>
-                <w:sz w:val="19"/>
+                <w:sz w:val="16"/>
               </w:rPr>
               <w:t>Machine Learning for Health Symposium (ML4H 2026)</w:t>
             </w:r>
@@ -163,13 +183,18 @@
             <w:pPr>
               <w:spacing w:after="0"/>
             </w:pPr>
-            <w:r/>
             <w:r>
               <w:rPr>
-                <w:rFonts w:ascii="Calibri" w:hAnsi="Calibri"/>
+                <w:rFonts w:ascii="Aptos" w:hAnsi="Aptos" w:eastAsia="Aptos"/>
+                <w:sz w:val="16"/>
+              </w:rPr>
+            </w:r>
+            <w:r>
+              <w:rPr>
+                <w:rFonts w:ascii="Aptos" w:hAnsi="Aptos" w:eastAsia="Aptos"/>
                 <w:b w:val="0"/>
                 <w:color w:val="000000"/>
-                <w:sz w:val="19"/>
+                <w:sz w:val="16"/>
               </w:rPr>
               <w:t>URL</w:t>
             </w:r>
@@ -184,13 +209,18 @@
             <w:pPr>
               <w:spacing w:after="0"/>
             </w:pPr>
-            <w:r/>
             <w:r>
               <w:rPr>
-                <w:rFonts w:ascii="Calibri" w:hAnsi="Calibri"/>
+                <w:rFonts w:ascii="Aptos" w:hAnsi="Aptos" w:eastAsia="Aptos"/>
+                <w:sz w:val="16"/>
+              </w:rPr>
+            </w:r>
+            <w:r>
+              <w:rPr>
+                <w:rFonts w:ascii="Aptos" w:hAnsi="Aptos" w:eastAsia="Aptos"/>
                 <w:b w:val="0"/>
                 <w:color w:val="000000"/>
-                <w:sz w:val="19"/>
+                <w:sz w:val="16"/>
               </w:rPr>
               <w:t>https://ml4h.ahli.cc/</w:t>
             </w:r>
@@ -207,13 +237,18 @@
             <w:pPr>
               <w:spacing w:after="0"/>
             </w:pPr>
-            <w:r/>
             <w:r>
               <w:rPr>
-                <w:rFonts w:ascii="Calibri" w:hAnsi="Calibri"/>
+                <w:rFonts w:ascii="Aptos" w:hAnsi="Aptos" w:eastAsia="Aptos"/>
+                <w:sz w:val="16"/>
+              </w:rPr>
+            </w:r>
+            <w:r>
+              <w:rPr>
+                <w:rFonts w:ascii="Aptos" w:hAnsi="Aptos" w:eastAsia="Aptos"/>
                 <w:b w:val="0"/>
                 <w:color w:val="000000"/>
-                <w:sz w:val="19"/>
+                <w:sz w:val="16"/>
               </w:rPr>
               <w:t>Author instructions / CFP</w:t>
             </w:r>
@@ -228,13 +263,18 @@
             <w:pPr>
               <w:spacing w:after="0"/>
             </w:pPr>
-            <w:r/>
             <w:r>
               <w:rPr>
-                <w:rFonts w:ascii="Calibri" w:hAnsi="Calibri"/>
+                <w:rFonts w:ascii="Aptos" w:hAnsi="Aptos" w:eastAsia="Aptos"/>
+                <w:sz w:val="16"/>
+              </w:rPr>
+            </w:r>
+            <w:r>
+              <w:rPr>
+                <w:rFonts w:ascii="Aptos" w:hAnsi="Aptos" w:eastAsia="Aptos"/>
                 <w:b w:val="0"/>
                 <w:color w:val="000000"/>
-                <w:sz w:val="19"/>
+                <w:sz w:val="16"/>
               </w:rPr>
               <w:t>https://ml4h.ahli.cc/submit/call-for-papers/</w:t>
             </w:r>
@@ -251,13 +291,18 @@
             <w:pPr>
               <w:spacing w:after="0"/>
             </w:pPr>
-            <w:r/>
             <w:r>
               <w:rPr>
-                <w:rFonts w:ascii="Calibri" w:hAnsi="Calibri"/>
+                <w:rFonts w:ascii="Aptos" w:hAnsi="Aptos" w:eastAsia="Aptos"/>
+                <w:sz w:val="16"/>
+              </w:rPr>
+            </w:r>
+            <w:r>
+              <w:rPr>
+                <w:rFonts w:ascii="Aptos" w:hAnsi="Aptos" w:eastAsia="Aptos"/>
                 <w:b w:val="0"/>
                 <w:color w:val="000000"/>
-                <w:sz w:val="19"/>
+                <w:sz w:val="16"/>
               </w:rPr>
               <w:t>Submission deadline</w:t>
             </w:r>
@@ -272,13 +317,18 @@
             <w:pPr>
               <w:spacing w:after="0"/>
             </w:pPr>
-            <w:r/>
             <w:r>
               <w:rPr>
-                <w:rFonts w:ascii="Calibri" w:hAnsi="Calibri"/>
+                <w:rFonts w:ascii="Aptos" w:hAnsi="Aptos" w:eastAsia="Aptos"/>
+                <w:sz w:val="16"/>
+              </w:rPr>
+            </w:r>
+            <w:r>
+              <w:rPr>
+                <w:rFonts w:ascii="Aptos" w:hAnsi="Aptos" w:eastAsia="Aptos"/>
                 <w:b w:val="0"/>
                 <w:color w:val="000000"/>
-                <w:sz w:val="19"/>
+                <w:sz w:val="16"/>
               </w:rPr>
               <w:t>September 10, 2026, 11:59 PM AoE</w:t>
             </w:r>
@@ -295,13 +345,18 @@
             <w:pPr>
               <w:spacing w:after="0"/>
             </w:pPr>
-            <w:r/>
             <w:r>
               <w:rPr>
-                <w:rFonts w:ascii="Calibri" w:hAnsi="Calibri"/>
+                <w:rFonts w:ascii="Aptos" w:hAnsi="Aptos" w:eastAsia="Aptos"/>
+                <w:sz w:val="16"/>
+              </w:rPr>
+            </w:r>
+            <w:r>
+              <w:rPr>
+                <w:rFonts w:ascii="Aptos" w:hAnsi="Aptos" w:eastAsia="Aptos"/>
                 <w:b w:val="0"/>
                 <w:color w:val="000000"/>
-                <w:sz w:val="19"/>
+                <w:sz w:val="16"/>
               </w:rPr>
               <w:t>Author notification</w:t>
             </w:r>
@@ -316,13 +371,18 @@
             <w:pPr>
               <w:spacing w:after="0"/>
             </w:pPr>
-            <w:r/>
             <w:r>
               <w:rPr>
-                <w:rFonts w:ascii="Calibri" w:hAnsi="Calibri"/>
+                <w:rFonts w:ascii="Aptos" w:hAnsi="Aptos" w:eastAsia="Aptos"/>
+                <w:sz w:val="16"/>
+              </w:rPr>
+            </w:r>
+            <w:r>
+              <w:rPr>
+                <w:rFonts w:ascii="Aptos" w:hAnsi="Aptos" w:eastAsia="Aptos"/>
                 <w:b w:val="0"/>
                 <w:color w:val="000000"/>
-                <w:sz w:val="19"/>
+                <w:sz w:val="16"/>
               </w:rPr>
               <w:t>October 22, 2026</w:t>
             </w:r>
@@ -339,13 +399,18 @@
             <w:pPr>
               <w:spacing w:after="0"/>
             </w:pPr>
-            <w:r/>
             <w:r>
               <w:rPr>
-                <w:rFonts w:ascii="Calibri" w:hAnsi="Calibri"/>
+                <w:rFonts w:ascii="Aptos" w:hAnsi="Aptos" w:eastAsia="Aptos"/>
+                <w:sz w:val="16"/>
+              </w:rPr>
+            </w:r>
+            <w:r>
+              <w:rPr>
+                <w:rFonts w:ascii="Aptos" w:hAnsi="Aptos" w:eastAsia="Aptos"/>
                 <w:b w:val="0"/>
                 <w:color w:val="000000"/>
-                <w:sz w:val="19"/>
+                <w:sz w:val="16"/>
               </w:rPr>
               <w:t>Camera-ready deadline</w:t>
             </w:r>
@@ -360,13 +425,18 @@
             <w:pPr>
               <w:spacing w:after="0"/>
             </w:pPr>
-            <w:r/>
             <w:r>
               <w:rPr>
-                <w:rFonts w:ascii="Calibri" w:hAnsi="Calibri"/>
+                <w:rFonts w:ascii="Aptos" w:hAnsi="Aptos" w:eastAsia="Aptos"/>
+                <w:sz w:val="16"/>
+              </w:rPr>
+            </w:r>
+            <w:r>
+              <w:rPr>
+                <w:rFonts w:ascii="Aptos" w:hAnsi="Aptos" w:eastAsia="Aptos"/>
                 <w:b w:val="0"/>
                 <w:color w:val="000000"/>
-                <w:sz w:val="19"/>
+                <w:sz w:val="16"/>
               </w:rPr>
               <w:t>November 7, 2026 (tentative)</w:t>
             </w:r>
@@ -383,13 +453,18 @@
             <w:pPr>
               <w:spacing w:after="0"/>
             </w:pPr>
-            <w:r/>
             <w:r>
               <w:rPr>
-                <w:rFonts w:ascii="Calibri" w:hAnsi="Calibri"/>
+                <w:rFonts w:ascii="Aptos" w:hAnsi="Aptos" w:eastAsia="Aptos"/>
+                <w:sz w:val="16"/>
+              </w:rPr>
+            </w:r>
+            <w:r>
+              <w:rPr>
+                <w:rFonts w:ascii="Aptos" w:hAnsi="Aptos" w:eastAsia="Aptos"/>
                 <w:b w:val="0"/>
                 <w:color w:val="000000"/>
-                <w:sz w:val="19"/>
+                <w:sz w:val="16"/>
               </w:rPr>
               <w:t>Event dates</w:t>
             </w:r>
@@ -404,13 +479,18 @@
             <w:pPr>
               <w:spacing w:after="0"/>
             </w:pPr>
-            <w:r/>
             <w:r>
               <w:rPr>
-                <w:rFonts w:ascii="Calibri" w:hAnsi="Calibri"/>
+                <w:rFonts w:ascii="Aptos" w:hAnsi="Aptos" w:eastAsia="Aptos"/>
+                <w:sz w:val="16"/>
+              </w:rPr>
+            </w:r>
+            <w:r>
+              <w:rPr>
+                <w:rFonts w:ascii="Aptos" w:hAnsi="Aptos" w:eastAsia="Aptos"/>
                 <w:b w:val="0"/>
                 <w:color w:val="000000"/>
-                <w:sz w:val="19"/>
+                <w:sz w:val="16"/>
               </w:rPr>
               <w:t>December 6-7, 2026</w:t>
             </w:r>
@@ -427,13 +507,18 @@
             <w:pPr>
               <w:spacing w:after="0"/>
             </w:pPr>
-            <w:r/>
             <w:r>
               <w:rPr>
-                <w:rFonts w:ascii="Calibri" w:hAnsi="Calibri"/>
+                <w:rFonts w:ascii="Aptos" w:hAnsi="Aptos" w:eastAsia="Aptos"/>
+                <w:sz w:val="16"/>
+              </w:rPr>
+            </w:r>
+            <w:r>
+              <w:rPr>
+                <w:rFonts w:ascii="Aptos" w:hAnsi="Aptos" w:eastAsia="Aptos"/>
                 <w:b w:val="0"/>
                 <w:color w:val="000000"/>
-                <w:sz w:val="19"/>
+                <w:sz w:val="16"/>
               </w:rPr>
               <w:t>Location</w:t>
             </w:r>
@@ -448,13 +533,18 @@
             <w:pPr>
               <w:spacing w:after="0"/>
             </w:pPr>
-            <w:r/>
             <w:r>
               <w:rPr>
-                <w:rFonts w:ascii="Calibri" w:hAnsi="Calibri"/>
+                <w:rFonts w:ascii="Aptos" w:hAnsi="Aptos" w:eastAsia="Aptos"/>
+                <w:sz w:val="16"/>
+              </w:rPr>
+            </w:r>
+            <w:r>
+              <w:rPr>
+                <w:rFonts w:ascii="Aptos" w:hAnsi="Aptos" w:eastAsia="Aptos"/>
                 <w:b w:val="0"/>
                 <w:color w:val="000000"/>
-                <w:sz w:val="19"/>
+                <w:sz w:val="16"/>
               </w:rPr>
               <w:t>Sydney, Australia</w:t>
             </w:r>
@@ -471,13 +561,18 @@
             <w:pPr>
               <w:spacing w:after="0"/>
             </w:pPr>
-            <w:r/>
             <w:r>
               <w:rPr>
-                <w:rFonts w:ascii="Calibri" w:hAnsi="Calibri"/>
+                <w:rFonts w:ascii="Aptos" w:hAnsi="Aptos" w:eastAsia="Aptos"/>
+                <w:sz w:val="16"/>
+              </w:rPr>
+            </w:r>
+            <w:r>
+              <w:rPr>
+                <w:rFonts w:ascii="Aptos" w:hAnsi="Aptos" w:eastAsia="Aptos"/>
                 <w:b w:val="0"/>
                 <w:color w:val="000000"/>
-                <w:sz w:val="19"/>
+                <w:sz w:val="16"/>
               </w:rPr>
               <w:t>Suggested track</w:t>
             </w:r>
@@ -490,7 +585,41 @@
           </w:tcPr>
           <w:p>
             <w:r>
+              <w:rPr>
+                <w:rFonts w:ascii="Aptos" w:hAnsi="Aptos" w:eastAsia="Aptos"/>
+                <w:sz w:val="16"/>
+              </w:rPr>
               <w:t>Findings Track for preliminary specification-conformance work; Proceedings Track only after independent review.</w:t>
+            </w:r>
+          </w:p>
+        </w:tc>
+      </w:tr>
+      <w:tr>
+        <w:tc>
+          <w:tcPr>
+            <w:tcW w:type="dxa" w:w="2600"/>
+          </w:tcPr>
+          <w:p>
+            <w:r>
+              <w:rPr>
+                <w:rFonts w:ascii="Aptos" w:hAnsi="Aptos" w:eastAsia="Aptos"/>
+                <w:sz w:val="16"/>
+              </w:rPr>
+              <w:t>Editable paper format</w:t>
+            </w:r>
+          </w:p>
+        </w:tc>
+        <w:tc>
+          <w:tcPr>
+            <w:tcW w:type="dxa" w:w="6760"/>
+          </w:tcPr>
+          <w:p>
+            <w:r>
+              <w:rPr>
+                <w:rFonts w:ascii="Aptos" w:hAnsi="Aptos" w:eastAsia="Aptos"/>
+                <w:sz w:val="16"/>
+              </w:rPr>
+              <w:t>LaTeX/Overleaf source: paper/ml4h_findings_evidence_gate.tex with paper/ml4h_findings_refs.bib; compiled PDF: paper/ml4h_findings_evidence_gate.pdf.</w:t>
             </w:r>
           </w:p>
         </w:tc>
@@ -519,7 +648,11 @@
     </w:p>
     <w:p>
       <w:r>
-        <w:t>Abstract: This capstone studies a narrowed clinical AI safety problem: LLM-drafted pharmacogenomic and genomic medication alerts can overstate what guideline-supported evidence actually permits. I implement a synthetic pre-display evidence gate with three checks: citation/guideline support, population fit, and endpoint/actionability. Stage 1 does not call an LLM or extract evidence features from free text; it tests a deterministic controller over structured evidence annotations. In 33 author-designed synthetic cases, the controller blocked or narrowed all 23 designed overclaim archetypes, allowed all 10 bounded alerts, and produced no inappropriate denials. Action conformance was 33/33 and primary-gate conformance was 31/33, with PGX19 and PGX24 revealing citation-first precedence effects. One-gate ablations show that each gate uniquely catches at least one failure archetype. These counts show specification conformance, not clinical utility, independent safety, or generalization.</w:t>
+        <w:rPr>
+          <w:rFonts w:ascii="Aptos" w:hAnsi="Aptos" w:eastAsia="Aptos"/>
+          <w:sz w:val="21"/>
+        </w:rPr>
+        <w:t>Abstract: Large language models can draft medication alerts whose fluency exceeds the evidence they cite. This capstone studies one workflow: pharmacogenomic and genomic medication-alert text. I implement a synthetic pre-display evidence gate with three checks: citation/guideline support, population fit, and endpoint/actionability. Stage 1 does not call an LLM or parse free text; it tests a deterministic controller over structured annotations. In one-gate ablations, disabling citation/guideline support, population fit, or endpoint/actionability allowed 2/23, 1/23, and 6/23 designed overclaims through unchanged, respectively. With all gates active, all 23 designed overclaim archetypes were blocked or narrowed and all 10 bounded alerts passed unchanged. Primary-gate conformance was 31/33, with two gate-precedence disagreements reported as negative results. These are specification-conformance results, not clinical safety, generalization, or patient-benefit evidence.</w:t>
       </w:r>
     </w:p>
     <w:p>

</xml_diff>

<commit_message>
Sharpen evidence monitor capstone package
</commit_message>
<xml_diff>
--- a/summary/Module_14_Summary_Sheet_Pruned_Evidence_Gate_Ravi_Bajaj.docx
+++ b/summary/Module_14_Summary_Sheet_Pruned_Evidence_Gate_Ravi_Bajaj.docx
@@ -652,7 +652,7 @@
           <w:rFonts w:ascii="Aptos" w:hAnsi="Aptos" w:eastAsia="Aptos"/>
           <w:sz w:val="21"/>
         </w:rPr>
-        <w:t>Abstract: Large language models can draft medication alerts whose fluency exceeds the evidence they cite. This capstone studies one workflow: pharmacogenomic and genomic medication-alert text. I implement a synthetic pre-display evidence gate with three checks: citation/guideline support, population fit, and endpoint/actionability. Stage 1 does not call an LLM or parse free text; it tests a deterministic controller over structured annotations. In one-gate ablations, disabling citation/guideline support, population fit, or endpoint/actionability allowed 2/23, 1/23, and 6/23 designed overclaims through unchanged, respectively. With all gates active, all 23 designed overclaim archetypes were blocked or narrowed and all 10 bounded alerts passed unchanged. Primary-gate conformance was 31/33, with two gate-precedence disagreements reported as negative results. These are specification-conformance results, not clinical safety, generalization, or patient-benefit evidence.</w:t>
+        <w:t>Abstract: LLM-generated medication alerts can sound more certain than their evidence permits. We built a deterministic pre-display monitor for one workflow: pharmacogenomic and genomic medication-alert text. The monitor checks source support, population fit, and claim strength, then returns allow, narrow, abstain, or deny. Stage 1 is a synthetic specification test: the case bank supplies the structured annotations that a future live system would need to extract, and ablation tests whether any check is dispensable. Disabling source support let 2 of 23 designed overclaims pass unchanged; disabling population fit let 1 pass; disabling claim strength let 6 pass. With all checks active, all 23 designed overclaim archetypes were blocked or narrowed and all 10 bounded alerts passed unchanged. The first-triggering check matched the author-assigned check label in 31 of 33 cases. These are specification-conformance results, not clinical safety, generalization, or patient-benefit evidence.</w:t>
       </w:r>
     </w:p>
     <w:p>
@@ -682,22 +682,9 @@
     <w:p>
       <w:pPr>
         <w:pStyle w:val="ListBullet"/>
-        <w:spacing w:after="60"/>
       </w:pPr>
       <w:r>
-        <w:t>Synthetic 33-case pharmacogenomic/genomic medication-alert case bank.</w:t>
-      </w:r>
-    </w:p>
-    <w:p>
-      <w:pPr>
-        <w:pStyle w:val="ListBullet"/>
-        <w:spacing w:after="60"/>
-      </w:pPr>
-      <w:r>
-        <w:rPr>
-          <w:rFonts w:ascii="Calibri" w:hAnsi="Calibri"/>
-        </w:rPr>
-        <w:t>Executable three-gate controller and tests.</w:t>
+        <w:t>Synthetic 33-case pharmacogenomic/genomic medication-alert case bank with no real patient data, PHI, diagnosis, or treatment recommendation.</w:t>
       </w:r>
     </w:p>
     <w:p>
@@ -705,31 +692,15 @@
         <w:pStyle w:val="ListBullet"/>
       </w:pPr>
       <w:r>
-        <w:t>One-gate ablation CSV showing isolated necessity of citation/guideline support, population fit, and endpoint/actionability gates.</w:t>
+        <w:t>Executable three-check controller with unit tests and deterministic replay outputs.</w:t>
       </w:r>
     </w:p>
     <w:p>
       <w:pPr>
         <w:pStyle w:val="ListBullet"/>
-        <w:spacing w:after="60"/>
       </w:pPr>
       <w:r>
-        <w:rPr>
-          <w:rFonts w:ascii="Calibri" w:hAnsi="Calibri"/>
-        </w:rPr>
-        <w:t>CSV/JSON results for overclaim detection, inappropriate denial, calibration, and gate/error categories.</w:t>
-      </w:r>
-    </w:p>
-    <w:p>
-      <w:pPr>
-        <w:pStyle w:val="ListBullet"/>
-        <w:spacing w:after="60"/>
-      </w:pPr>
-      <w:r>
-        <w:rPr>
-          <w:rFonts w:ascii="Calibri" w:hAnsi="Calibri"/>
-        </w:rPr>
-        <w:t>No real patient data, no protected health information, no diagnosis, and no treatment recommendation.</w:t>
+        <w:t>One-check ablation CSV plus CSV/JSON summaries for overclaim handling, inappropriate denial, calibration, and check/error categories.</w:t>
       </w:r>
     </w:p>
     <w:sectPr>

</xml_diff>

<commit_message>
Add LLM baselines and evidence-boundary framing
</commit_message>
<xml_diff>
--- a/summary/Module_14_Summary_Sheet_Pruned_Evidence_Gate_Ravi_Bajaj.docx
+++ b/summary/Module_14_Summary_Sheet_Pruned_Evidence_Gate_Ravi_Bajaj.docx
@@ -648,11 +648,7 @@
     </w:p>
     <w:p>
       <w:r>
-        <w:rPr>
-          <w:rFonts w:ascii="Aptos" w:hAnsi="Aptos" w:eastAsia="Aptos"/>
-          <w:sz w:val="21"/>
-        </w:rPr>
-        <w:t>Abstract: LLM-generated medication alerts can sound more certain than their evidence permits. We built a deterministic pre-display monitor for one workflow: pharmacogenomic and genomic medication-alert text. The monitor checks source support, population fit, and claim strength, then returns allow, narrow, abstain, or deny. Stage 1 is a synthetic specification test: the case bank supplies the structured annotations that a future live system would need to extract, and ablation tests whether any check is dispensable. Disabling source support let 2 of 23 designed overclaims pass unchanged; disabling population fit let 1 pass; disabling claim strength let 6 pass. With all checks active, all 23 designed overclaim archetypes were blocked or narrowed and all 10 bounded alerts passed unchanged. The first-triggering check matched the author-assigned check label in 31 of 33 cases. These are specification-conformance results, not clinical safety, generalization, or patient-benefit evidence.</w:t>
+        <w:t>Abstract: LLM-generated medication alerts can sound more certain than their evidence permits. We built a deterministic pre-display monitor for one workflow: pharmacogenomic and genomic medication-alert text. The monitor checks source support, population fit, and claim strength, then returns allow, narrow, abstain, or deny. Stage 1 is a synthetic specification test: the case bank supplies the structured annotations that a future live system would need to extract, and ablation tests whether any check is dispensable. Disabling source support let 2 of 23 designed overclaims pass unchanged; disabling population fit let 1 pass; disabling claim strength let 6 pass. With all checks active, all 23 designed overclaim archetypes were blocked or narrowed and all 10 bounded alerts passed unchanged. Two LLM self-evaluation baselines, GPT-5.6-terra and Grok-4.5, also routed all 23 overclaims, but differed from the deterministic monitor on selected actions or surfaced rationales. The first-triggering check matched the author-assigned check label in 31 of 33 cases, interpreted as precedence sensitivity rather than action failure. These are specification-conformance results, not clinical safety, generalization, or patient-benefit evidence.</w:t>
       </w:r>
     </w:p>
     <w:p>
@@ -665,10 +661,7 @@
     </w:p>
     <w:p>
       <w:r>
-        <w:rPr>
-          <w:rFonts w:ascii="Calibri" w:hAnsi="Calibri"/>
-        </w:rPr>
-        <w:t>Generative AI tools were used for brainstorming, critique, code scaffolding, drafting, packaging, and formatting. The author selected the final scope, directed the pruning, verified sources, reviewed generated text, ran local tests, and remains responsible for all claims, limitations, and submission materials.</w:t>
+        <w:t>Generative AI tools were used for brainstorming, critique, code scaffolding, drafting, packaging, formatting, and for an LLM self-evaluation baseline on synthetic annotations only. The baseline used GPT-5.6-terra and Grok-4.5; no real patient records, protected health information, or private genomic data were transmitted. The author selected the final scope, directed the pruning, verified sources, reviewed generated text, ran local tests, and remains responsible for all claims, limitations, and submission materials.</w:t>
       </w:r>
     </w:p>
     <w:p>
@@ -700,7 +693,20 @@
         <w:pStyle w:val="ListBullet"/>
       </w:pPr>
       <w:r>
-        <w:t>One-check ablation CSV plus CSV/JSON summaries for overclaim handling, inappropriate denial, calibration, and check/error categories.</w:t>
+        <w:t>One-check ablation CSV, precedence-sensitivity CSV, LLM self-evaluation baseline CSV/JSON outputs, and CSV/JSON summaries for overclaim handling, inappropriate denial, calibration, and check categories.</w:t>
+      </w:r>
+    </w:p>
+    <w:p>
+      <w:pPr>
+        <w:pStyle w:val="Heading1"/>
+      </w:pPr>
+      <w:r>
+        <w:t>Evidence-Boundary Framework</w:t>
+      </w:r>
+    </w:p>
+    <w:p>
+      <w:r>
+        <w:t>The empirical workflow is pharmacogenomics, but the design pattern is broader: source support asks whether evidence exists and applies; population fit asks whether evidence transports to the target patient or population; and claim strength asks whether the evidence supports the displayed action rather than only a weaker association or surrogate endpoint.</w:t>
       </w:r>
     </w:p>
     <w:sectPr>

</xml_diff>

<commit_message>
Fix citation boundary baseline for capstone package
</commit_message>
<xml_diff>
--- a/summary/Module_14_Summary_Sheet_Pruned_Evidence_Gate_Ravi_Bajaj.docx
+++ b/summary/Module_14_Summary_Sheet_Pruned_Evidence_Gate_Ravi_Bajaj.docx
@@ -648,7 +648,7 @@
     </w:p>
     <w:p>
       <w:r>
-        <w:t>Abstract: LLM-generated medication alerts can sound more certain than their evidence permits. We built a deterministic pre-display monitor for one workflow: pharmacogenomic and genomic medication-alert text. The monitor checks source support, population fit, and claim strength, then returns allow, narrow, abstain, or deny. Stage 1 is a synthetic specification test: the case bank supplies the structured annotations that a future live system would need to extract, and ablation tests whether any check is dispensable. Disabling source support let 2 of 23 designed overclaims pass unchanged; disabling population fit let 1 pass; disabling claim strength let 6 pass. With all checks active, all 23 designed overclaim archetypes were blocked or narrowed and all 10 bounded alerts passed unchanged. Two LLM self-evaluation baselines, GPT-5.6-terra and Grok-4.5, also routed all 23 overclaims, but differed from the deterministic monitor on selected actions or surfaced rationales. The first-triggering check matched the author-assigned check label in 31 of 33 cases, interpreted as precedence sensitivity rather than action failure. These are specification-conformance results, not clinical safety, generalization, or patient-benefit evidence.</w:t>
+        <w:t>Abstract: LLM-generated medication alerts can sound more certain than their evidence permits. We built a deterministic pre-display monitor for one workflow: pharmacogenomic and genomic medication-alert text. The monitor checks source support, population fit, and claim strength, then returns allow, narrow, abstain, or deny. Stage 1 is a synthetic specification test: the case bank supplies the structured annotations a future live system would need to extract, and ablation tests whether any check is dispensable. Disabling source support, population fit, or claim strength let 2, 1, and 6 of 23 designed overclaims pass unchanged, respectively. With all checks active, 23/23 designed overclaim archetypes were routed and 10/10 bounded alerts passed unchanged. Arm A froze a full-bank LLM baseline that included the source-support label; GPT-5.6-terra and Grok-4.5 each routed 23/23 overclaims and preserved 10/10 bounded alerts. Arm B withheld the source-support label for PGX31-PGX33 and supplied structured citations; both models matched the deterministic action and primary check on all three isolating cases. These are specification-conformance results, not clinical safety, annotation validity, generalization, or patient-benefit evidence.</w:t>
       </w:r>
     </w:p>
     <w:p>
@@ -661,7 +661,7 @@
     </w:p>
     <w:p>
       <w:r>
-        <w:t>Generative AI tools were used for brainstorming, critique, code scaffolding, drafting, packaging, formatting, and for an LLM self-evaluation baseline on synthetic annotations only. The baseline used GPT-5.6-terra and Grok-4.5; no real patient records, protected health information, or private genomic data were transmitted. The author selected the final scope, directed the pruning, verified sources, reviewed generated text, ran local tests, and remains responsible for all claims, limitations, and submission materials.</w:t>
+        <w:t>Generative AI tools were used for brainstorming, critique, code scaffolding, drafting, packaging, formatting, and LLM self-evaluation baselines on synthetic annotations only. Arm A used GPT-5.6-terra and Grok-4.5 with full structured labels; Arm B used the same models on PGX31-PGX33 with source-support labels withheld and structured citations supplied. No real patient records, protected health information, or private genomic data were transmitted. The author selected the final scope, directed the pruning, verified sources, reviewed generated text, ran local tests, and remains responsible for all claims, limitations, and submission materials.</w:t>
       </w:r>
     </w:p>
     <w:p>
@@ -693,7 +693,7 @@
         <w:pStyle w:val="ListBullet"/>
       </w:pPr>
       <w:r>
-        <w:t>One-check ablation CSV, precedence-sensitivity CSV, LLM self-evaluation baseline CSV/JSON outputs, and CSV/JSON summaries for overclaim handling, inappropriate denial, calibration, and check categories.</w:t>
+        <w:t>One-check ablation CSV, precedence-sensitivity CSV, Arm A/Arm B LLM self-evaluation CSV/JSON outputs, synthetic uniform-NARROW sanity outputs, and CSV/JSON summaries for overclaim handling, inappropriate denial, calibration, and check categories.</w:t>
       </w:r>
     </w:p>
     <w:p>

</xml_diff>

<commit_message>
Tighten Arm B citation leakage controls
</commit_message>
<xml_diff>
--- a/summary/Module_14_Summary_Sheet_Pruned_Evidence_Gate_Ravi_Bajaj.docx
+++ b/summary/Module_14_Summary_Sheet_Pruned_Evidence_Gate_Ravi_Bajaj.docx
@@ -648,7 +648,7 @@
     </w:p>
     <w:p>
       <w:r>
-        <w:t>Abstract: LLM-generated medication alerts can sound more certain than their evidence permits. We built a deterministic pre-display monitor for one workflow: pharmacogenomic and genomic medication-alert text. The monitor checks source support, population fit, and claim strength, then returns allow, narrow, abstain, or deny. Stage 1 is a synthetic specification test: the case bank supplies the structured annotations a future live system would need to extract, and ablation tests whether any check is dispensable. Disabling source support, population fit, or claim strength let 2, 1, and 6 of 23 designed overclaims pass unchanged, respectively. With all checks active, 23/23 designed overclaim archetypes were routed and 10/10 bounded alerts passed unchanged. Arm A froze a full-bank LLM baseline that included the source-support label; GPT-5.6-terra and Grok-4.5 each routed 23/23 overclaims and preserved 10/10 bounded alerts. Arm B withheld the source-support label for PGX31-PGX33 and supplied structured citations; both models matched the deterministic action and primary check on all three isolating cases. These are specification-conformance results, not clinical safety, annotation validity, generalization, or patient-benefit evidence.</w:t>
+        <w:t>Abstract: LLM-generated medication alerts can sound more certain than their evidence permits. We built a deterministic pre-display monitor for one workflow: pharmacogenomic and genomic medication-alert text. The monitor checks source support, population fit, and claim strength, then returns allow, narrow, abstain, or deny. Stage 1 is a synthetic specification test: the case bank supplies the structured annotations a future live system would need to extract, and ablation tests whether any check is dispensable. Disabling source support, population fit, or claim strength let 2, 1, and 6 of 23 designed overclaims pass unchanged, respectively. With all checks active, 23/23 designed overclaim archetypes were routed and 10/10 bounded alerts passed unchanged. Arm A froze a full-bank LLM baseline that included the source-support label; GPT-5.6-terra and Grok-4.5 each routed 23/23 overclaims and preserved 10/10 bounded alerts. Arm B withheld the source-support label for PGX31-PGX33 and supplied structured citations after sentinel cues were removed; GPT-5.6-terra matched PGX32 and PGX33 but attributed PGX31 to claim strength, while Grok-4.5 matched PGX31 and PGX32 but attributed PGX33 to claim strength. These are specification-conformance results, not clinical safety, annotation validity, generalization, or patient-benefit evidence.</w:t>
       </w:r>
     </w:p>
     <w:p>
@@ -661,7 +661,7 @@
     </w:p>
     <w:p>
       <w:r>
-        <w:t>Generative AI tools were used for brainstorming, critique, code scaffolding, drafting, packaging, formatting, and LLM self-evaluation baselines on synthetic annotations only. Arm A used GPT-5.6-terra and Grok-4.5 with full structured labels; Arm B used the same models on PGX31-PGX33 with source-support labels withheld and structured citations supplied. No real patient records, protected health information, or private genomic data were transmitted. The author selected the final scope, directed the pruning, verified sources, reviewed generated text, ran local tests, and remains responsible for all claims, limitations, and submission materials.</w:t>
+        <w:t>Generative AI tools were used for brainstorming, critique, code scaffolding, drafting, packaging, formatting, and LLM self-evaluation baselines on synthetic annotations only. Arm A used GPT-5.6-terra and Grok-4.5 with full structured labels; Arm B used the same models on PGX31-PGX33 with source-support labels withheld, sentinel cues removed, and structured citations supplied. No real patient records, protected health information, or private genomic data were transmitted. The author selected the final scope, directed the pruning, verified sources, reviewed generated text, ran local tests, and remains responsible for all claims, limitations, and submission materials.</w:t>
       </w:r>
     </w:p>
     <w:p>

</xml_diff>

<commit_message>
Reframe Stage 1 as executable specification
</commit_message>
<xml_diff>
--- a/summary/Module_14_Summary_Sheet_Pruned_Evidence_Gate_Ravi_Bajaj.docx
+++ b/summary/Module_14_Summary_Sheet_Pruned_Evidence_Gate_Ravi_Bajaj.docx
@@ -21,13 +21,7 @@
         <w:spacing w:after="80"/>
       </w:pPr>
       <w:r>
-        <w:rPr>
-          <w:rFonts w:ascii="Calibri" w:hAnsi="Calibri"/>
-          <w:i/>
-          <w:color w:val="555555"/>
-          <w:sz w:val="23"/>
-        </w:rPr>
-        <w:t>Pruned evidence-gated pharmacogenomic LLM-alert capstone</w:t>
+        <w:t>Executable evidence-gate specification for pharmacogenomic LLM-alert review</w:t>
       </w:r>
     </w:p>
     <w:p>
@@ -640,15 +634,12 @@
     </w:p>
     <w:p>
       <w:r>
-        <w:rPr>
-          <w:rFonts w:ascii="Calibri" w:hAnsi="Calibri"/>
-        </w:rPr>
-        <w:t>Title: Evidence-Gated Medical LLM Alerts for Pharmacogenomic Claims: Detecting Overclaiming Relative to Guideline-Supported Evidence</w:t>
+        <w:t>Title: An Executable Evidence-Gate Specification for Pharmacogenomic LLM Alerts</w:t>
       </w:r>
     </w:p>
     <w:p>
       <w:r>
-        <w:t>Abstract: LLM-generated medication alerts can sound more certain than their evidence permits. We built a deterministic pre-display monitor for one workflow: pharmacogenomic and genomic medication-alert text. The monitor checks source support, population fit, and claim strength, then returns allow, narrow, abstain, or deny. Stage 1 is a synthetic specification test: the case bank supplies the structured annotations a future live system would need to extract, and ablation tests whether any check is dispensable. Disabling source support, population fit, or claim strength let 2, 1, and 6 of 23 designed overclaims pass unchanged, respectively. With all checks active, 23/23 designed overclaim archetypes were routed and 10/10 bounded alerts passed unchanged. Arm A froze a full-bank LLM baseline that included the source-support label; GPT-5.6-terra and Grok-4.5 each routed 23/23 overclaims and preserved 10/10 bounded alerts. Arm B withheld the source-support label for PGX31-PGX33 and supplied structured citations after sentinel cues were removed and PGX33 was tied to the primary Muir 2014 DOI source; GPT-5.6-terra matched all three deterministic actions and primary checks, while Grok-4.5 matched PGX31 and PGX32 but attributed PGX33 to claim strength. These are specification-conformance results, not clinical safety, annotation validity, generalization, or patient-benefit evidence.</w:t>
+        <w:t>Abstract: LLM-generated medication alerts can sound more certain than their evidence permits. We built an executable Stage 1 specification for pharmacogenomic and genomic medication-alert text. Given structured annotations that a future live system would need to extract, the specification checks source support, population fit, and claim strength, then returns allow, narrow, abstain, or deny. Stage 1 uses author-designed synthetic cases with oracle annotations; it is a conformance and preregistration scaffold, not an end-to-end clinical system. Disabling source support, population fit, or claim strength let 2, 1, and 6 of 23 designed overclaims pass unchanged, respectively. A claim-strength-only comparator left 3/23 overclaims unchanged (PGX31-PGX33), while the full monitor routed 23/23 and preserved 10/10 bounded alerts. Arm B withheld source-support labels for PGX31-PGX33; GPT-5.6-terra matched all three deterministic actions and primary checks, while Grok-4.5 matched PGX31 and PGX32 but attributed PGX33 to claim strength. These are specification-conformance results, not clinical safety, annotation validity, generalization, or patient-benefit evidence.</w:t>
       </w:r>
     </w:p>
     <w:p>
@@ -693,7 +684,7 @@
         <w:pStyle w:val="ListBullet"/>
       </w:pPr>
       <w:r>
-        <w:t>One-check ablation CSV, precedence-sensitivity CSV, Arm A/Arm B LLM self-evaluation CSV/JSON outputs, synthetic uniform-NARROW sanity outputs, and CSV/JSON summaries for overclaim handling, inappropriate denial, calibration, and check categories.</w:t>
+        <w:t>One-check ablation CSV, simple policy-comparator CSV, precedence-sensitivity CSV, Arm A/Arm B LLM self-evaluation CSV/JSON outputs, synthetic uniform-NARROW sanity outputs, and CSV/JSON summaries for overclaim handling, inappropriate denial, calibration, and check categories.</w:t>
       </w:r>
     </w:p>
     <w:p>

</xml_diff>

<commit_message>
Add ambitious extraction experiments
</commit_message>
<xml_diff>
--- a/summary/Module_14_Summary_Sheet_Pruned_Evidence_Gate_Ravi_Bajaj.docx
+++ b/summary/Module_14_Summary_Sheet_Pruned_Evidence_Gate_Ravi_Bajaj.docx
@@ -10,31 +10,22 @@
         <w:rPr>
           <w:rFonts w:ascii="Calibri" w:hAnsi="Calibri"/>
           <w:b/>
-          <w:color w:val="1F4D78"/>
-          <w:sz w:val="38"/>
+          <w:color w:val="0B2545"/>
+          <w:sz w:val="36"/>
         </w:rPr>
         <w:t>Summary Sheet</w:t>
       </w:r>
     </w:p>
     <w:p>
       <w:pPr>
-        <w:spacing w:after="80"/>
-      </w:pPr>
-      <w:r>
-        <w:t>Executable evidence-gate specification for pharmacogenomic LLM-alert review</w:t>
-      </w:r>
-    </w:p>
-    <w:p>
-      <w:pPr>
-        <w:spacing w:after="240"/>
+        <w:spacing w:after="160"/>
       </w:pPr>
       <w:r>
         <w:rPr>
-          <w:rFonts w:ascii="Calibri" w:hAnsi="Calibri"/>
           <w:color w:val="555555"/>
-          <w:sz w:val="19"/>
+          <w:sz w:val="20"/>
         </w:rPr>
-        <w:t>Author: Ravi Bajaj | Course: AI in Healthcare</w:t>
+        <w:t>Ravi Bajaj | AI in Healthcare | Final paper: A Deterministic Evidence Gate for Pharmacogenomic LLM Alerts: Synthetic Stress-Testing with Ablation</w:t>
       </w:r>
     </w:p>
     <w:p>
@@ -48,38 +39,32 @@
     <w:tbl>
       <w:tblPr>
         <w:tblStyle w:val="TableGrid"/>
-        <w:tblW w:type="dxa" w:w="9360"/>
+        <w:tblW w:type="auto" w:w="0"/>
         <w:jc w:val="left"/>
         <w:tblLayout w:type="fixed"/>
         <w:tblLook w:firstColumn="1" w:firstRow="1" w:lastColumn="0" w:lastRow="0" w:noHBand="0" w:noVBand="1" w:val="04A0"/>
+        <w:tblCellMar>
+          <w:top w:w="80" w:type="dxa"/>
+          <w:start w:w="120" w:type="dxa"/>
+          <w:bottom w:w="80" w:type="dxa"/>
+          <w:end w:w="120" w:type="dxa"/>
+        </w:tblCellMar>
       </w:tblPr>
       <w:tblGrid>
-        <w:gridCol w:w="2600"/>
-        <w:gridCol w:w="6760"/>
+        <w:gridCol w:w="5040"/>
+        <w:gridCol w:w="5040"/>
       </w:tblGrid>
       <w:tr>
         <w:tc>
           <w:tcPr>
-            <w:tcW w:type="dxa" w:w="2600"/>
+            <w:tcW w:type="dxa" w:w="2664"/>
             <w:vAlign w:val="center"/>
-            <w:shd w:fill="F4F6F9"/>
+            <w:shd w:fill="E8EEF5"/>
           </w:tcPr>
           <w:p>
-            <w:pPr>
-              <w:spacing w:after="0"/>
-            </w:pPr>
             <w:r>
               <w:rPr>
-                <w:rFonts w:ascii="Aptos" w:hAnsi="Aptos" w:eastAsia="Aptos"/>
-                <w:sz w:val="16"/>
-              </w:rPr>
-            </w:r>
-            <w:r>
-              <w:rPr>
-                <w:rFonts w:ascii="Aptos" w:hAnsi="Aptos" w:eastAsia="Aptos"/>
                 <w:b/>
-                <w:color w:val="000000"/>
-                <w:sz w:val="16"/>
               </w:rPr>
               <w:t>Field</w:t>
             </w:r>
@@ -87,26 +72,14 @@
         </w:tc>
         <w:tc>
           <w:tcPr>
-            <w:tcW w:type="dxa" w:w="6760"/>
+            <w:tcW w:type="dxa" w:w="7416"/>
             <w:vAlign w:val="center"/>
-            <w:shd w:fill="F4F6F9"/>
+            <w:shd w:fill="E8EEF5"/>
           </w:tcPr>
           <w:p>
-            <w:pPr>
-              <w:spacing w:after="0"/>
-            </w:pPr>
             <w:r>
               <w:rPr>
-                <w:rFonts w:ascii="Aptos" w:hAnsi="Aptos" w:eastAsia="Aptos"/>
-                <w:sz w:val="16"/>
-              </w:rPr>
-            </w:r>
-            <w:r>
-              <w:rPr>
-                <w:rFonts w:ascii="Aptos" w:hAnsi="Aptos" w:eastAsia="Aptos"/>
                 <w:b/>
-                <w:color w:val="000000"/>
-                <w:sz w:val="16"/>
               </w:rPr>
               <w:t>Value</w:t>
             </w:r>
@@ -116,25 +89,12 @@
       <w:tr>
         <w:tc>
           <w:tcPr>
-            <w:tcW w:type="dxa" w:w="2600"/>
-            <w:vAlign w:val="center"/>
+            <w:tcW w:type="dxa" w:w="5040"/>
           </w:tcPr>
           <w:p>
-            <w:pPr>
-              <w:spacing w:after="0"/>
-            </w:pPr>
             <w:r>
               <w:rPr>
-                <w:rFonts w:ascii="Aptos" w:hAnsi="Aptos" w:eastAsia="Aptos"/>
-                <w:sz w:val="16"/>
-              </w:rPr>
-            </w:r>
-            <w:r>
-              <w:rPr>
-                <w:rFonts w:ascii="Aptos" w:hAnsi="Aptos" w:eastAsia="Aptos"/>
-                <w:b w:val="0"/>
-                <w:color w:val="000000"/>
-                <w:sz w:val="16"/>
+                <w:b/>
               </w:rPr>
               <w:t>Name</w:t>
             </w:r>
@@ -142,26 +102,10 @@
         </w:tc>
         <w:tc>
           <w:tcPr>
-            <w:tcW w:type="dxa" w:w="6760"/>
-            <w:vAlign w:val="center"/>
+            <w:tcW w:type="dxa" w:w="5040"/>
           </w:tcPr>
           <w:p>
-            <w:pPr>
-              <w:spacing w:after="0"/>
-            </w:pPr>
             <w:r>
-              <w:rPr>
-                <w:rFonts w:ascii="Aptos" w:hAnsi="Aptos" w:eastAsia="Aptos"/>
-                <w:sz w:val="16"/>
-              </w:rPr>
-            </w:r>
-            <w:r>
-              <w:rPr>
-                <w:rFonts w:ascii="Aptos" w:hAnsi="Aptos" w:eastAsia="Aptos"/>
-                <w:b w:val="0"/>
-                <w:color w:val="000000"/>
-                <w:sz w:val="16"/>
-              </w:rPr>
               <w:t>Machine Learning for Health Symposium (ML4H 2026)</w:t>
             </w:r>
           </w:p>
@@ -170,52 +114,23 @@
       <w:tr>
         <w:tc>
           <w:tcPr>
-            <w:tcW w:type="dxa" w:w="2600"/>
-            <w:vAlign w:val="center"/>
+            <w:tcW w:type="dxa" w:w="5040"/>
           </w:tcPr>
           <w:p>
-            <w:pPr>
-              <w:spacing w:after="0"/>
-            </w:pPr>
             <w:r>
               <w:rPr>
-                <w:rFonts w:ascii="Aptos" w:hAnsi="Aptos" w:eastAsia="Aptos"/>
-                <w:sz w:val="16"/>
+                <w:b/>
               </w:rPr>
-            </w:r>
-            <w:r>
-              <w:rPr>
-                <w:rFonts w:ascii="Aptos" w:hAnsi="Aptos" w:eastAsia="Aptos"/>
-                <w:b w:val="0"/>
-                <w:color w:val="000000"/>
-                <w:sz w:val="16"/>
-              </w:rPr>
-              <w:t>URL</w:t>
+              <w:t>Conference URL</w:t>
             </w:r>
           </w:p>
         </w:tc>
         <w:tc>
           <w:tcPr>
-            <w:tcW w:type="dxa" w:w="6760"/>
-            <w:vAlign w:val="center"/>
+            <w:tcW w:type="dxa" w:w="5040"/>
           </w:tcPr>
           <w:p>
-            <w:pPr>
-              <w:spacing w:after="0"/>
-            </w:pPr>
             <w:r>
-              <w:rPr>
-                <w:rFonts w:ascii="Aptos" w:hAnsi="Aptos" w:eastAsia="Aptos"/>
-                <w:sz w:val="16"/>
-              </w:rPr>
-            </w:r>
-            <w:r>
-              <w:rPr>
-                <w:rFonts w:ascii="Aptos" w:hAnsi="Aptos" w:eastAsia="Aptos"/>
-                <w:b w:val="0"/>
-                <w:color w:val="000000"/>
-                <w:sz w:val="16"/>
-              </w:rPr>
               <w:t>https://ml4h.ahli.cc/</w:t>
             </w:r>
           </w:p>
@@ -224,52 +139,23 @@
       <w:tr>
         <w:tc>
           <w:tcPr>
-            <w:tcW w:type="dxa" w:w="2600"/>
-            <w:vAlign w:val="center"/>
+            <w:tcW w:type="dxa" w:w="5040"/>
           </w:tcPr>
           <w:p>
-            <w:pPr>
-              <w:spacing w:after="0"/>
-            </w:pPr>
             <w:r>
               <w:rPr>
-                <w:rFonts w:ascii="Aptos" w:hAnsi="Aptos" w:eastAsia="Aptos"/>
-                <w:sz w:val="16"/>
+                <w:b/>
               </w:rPr>
-            </w:r>
-            <w:r>
-              <w:rPr>
-                <w:rFonts w:ascii="Aptos" w:hAnsi="Aptos" w:eastAsia="Aptos"/>
-                <w:b w:val="0"/>
-                <w:color w:val="000000"/>
-                <w:sz w:val="16"/>
-              </w:rPr>
-              <w:t>Author instructions / CFP</w:t>
+              <w:t>Instructions / CFP</w:t>
             </w:r>
           </w:p>
         </w:tc>
         <w:tc>
           <w:tcPr>
-            <w:tcW w:type="dxa" w:w="6760"/>
-            <w:vAlign w:val="center"/>
+            <w:tcW w:type="dxa" w:w="5040"/>
           </w:tcPr>
           <w:p>
-            <w:pPr>
-              <w:spacing w:after="0"/>
-            </w:pPr>
             <w:r>
-              <w:rPr>
-                <w:rFonts w:ascii="Aptos" w:hAnsi="Aptos" w:eastAsia="Aptos"/>
-                <w:sz w:val="16"/>
-              </w:rPr>
-            </w:r>
-            <w:r>
-              <w:rPr>
-                <w:rFonts w:ascii="Aptos" w:hAnsi="Aptos" w:eastAsia="Aptos"/>
-                <w:b w:val="0"/>
-                <w:color w:val="000000"/>
-                <w:sz w:val="16"/>
-              </w:rPr>
               <w:t>https://ml4h.ahli.cc/submit/call-for-papers/</w:t>
             </w:r>
           </w:p>
@@ -278,25 +164,12 @@
       <w:tr>
         <w:tc>
           <w:tcPr>
-            <w:tcW w:type="dxa" w:w="2600"/>
-            <w:vAlign w:val="center"/>
+            <w:tcW w:type="dxa" w:w="5040"/>
           </w:tcPr>
           <w:p>
-            <w:pPr>
-              <w:spacing w:after="0"/>
-            </w:pPr>
             <w:r>
               <w:rPr>
-                <w:rFonts w:ascii="Aptos" w:hAnsi="Aptos" w:eastAsia="Aptos"/>
-                <w:sz w:val="16"/>
-              </w:rPr>
-            </w:r>
-            <w:r>
-              <w:rPr>
-                <w:rFonts w:ascii="Aptos" w:hAnsi="Aptos" w:eastAsia="Aptos"/>
-                <w:b w:val="0"/>
-                <w:color w:val="000000"/>
-                <w:sz w:val="16"/>
+                <w:b/>
               </w:rPr>
               <w:t>Submission deadline</w:t>
             </w:r>
@@ -304,26 +177,10 @@
         </w:tc>
         <w:tc>
           <w:tcPr>
-            <w:tcW w:type="dxa" w:w="6760"/>
-            <w:vAlign w:val="center"/>
+            <w:tcW w:type="dxa" w:w="5040"/>
           </w:tcPr>
           <w:p>
-            <w:pPr>
-              <w:spacing w:after="0"/>
-            </w:pPr>
             <w:r>
-              <w:rPr>
-                <w:rFonts w:ascii="Aptos" w:hAnsi="Aptos" w:eastAsia="Aptos"/>
-                <w:sz w:val="16"/>
-              </w:rPr>
-            </w:r>
-            <w:r>
-              <w:rPr>
-                <w:rFonts w:ascii="Aptos" w:hAnsi="Aptos" w:eastAsia="Aptos"/>
-                <w:b w:val="0"/>
-                <w:color w:val="000000"/>
-                <w:sz w:val="16"/>
-              </w:rPr>
               <w:t>September 10, 2026, 11:59 PM AoE</w:t>
             </w:r>
           </w:p>
@@ -332,25 +189,12 @@
       <w:tr>
         <w:tc>
           <w:tcPr>
-            <w:tcW w:type="dxa" w:w="2600"/>
-            <w:vAlign w:val="center"/>
+            <w:tcW w:type="dxa" w:w="5040"/>
           </w:tcPr>
           <w:p>
-            <w:pPr>
-              <w:spacing w:after="0"/>
-            </w:pPr>
             <w:r>
               <w:rPr>
-                <w:rFonts w:ascii="Aptos" w:hAnsi="Aptos" w:eastAsia="Aptos"/>
-                <w:sz w:val="16"/>
-              </w:rPr>
-            </w:r>
-            <w:r>
-              <w:rPr>
-                <w:rFonts w:ascii="Aptos" w:hAnsi="Aptos" w:eastAsia="Aptos"/>
-                <w:b w:val="0"/>
-                <w:color w:val="000000"/>
-                <w:sz w:val="16"/>
+                <w:b/>
               </w:rPr>
               <w:t>Author notification</w:t>
             </w:r>
@@ -358,26 +202,10 @@
         </w:tc>
         <w:tc>
           <w:tcPr>
-            <w:tcW w:type="dxa" w:w="6760"/>
-            <w:vAlign w:val="center"/>
+            <w:tcW w:type="dxa" w:w="5040"/>
           </w:tcPr>
           <w:p>
-            <w:pPr>
-              <w:spacing w:after="0"/>
-            </w:pPr>
             <w:r>
-              <w:rPr>
-                <w:rFonts w:ascii="Aptos" w:hAnsi="Aptos" w:eastAsia="Aptos"/>
-                <w:sz w:val="16"/>
-              </w:rPr>
-            </w:r>
-            <w:r>
-              <w:rPr>
-                <w:rFonts w:ascii="Aptos" w:hAnsi="Aptos" w:eastAsia="Aptos"/>
-                <w:b w:val="0"/>
-                <w:color w:val="000000"/>
-                <w:sz w:val="16"/>
-              </w:rPr>
               <w:t>October 22, 2026</w:t>
             </w:r>
           </w:p>
@@ -386,25 +214,12 @@
       <w:tr>
         <w:tc>
           <w:tcPr>
-            <w:tcW w:type="dxa" w:w="2600"/>
-            <w:vAlign w:val="center"/>
+            <w:tcW w:type="dxa" w:w="5040"/>
           </w:tcPr>
           <w:p>
-            <w:pPr>
-              <w:spacing w:after="0"/>
-            </w:pPr>
             <w:r>
               <w:rPr>
-                <w:rFonts w:ascii="Aptos" w:hAnsi="Aptos" w:eastAsia="Aptos"/>
-                <w:sz w:val="16"/>
-              </w:rPr>
-            </w:r>
-            <w:r>
-              <w:rPr>
-                <w:rFonts w:ascii="Aptos" w:hAnsi="Aptos" w:eastAsia="Aptos"/>
-                <w:b w:val="0"/>
-                <w:color w:val="000000"/>
-                <w:sz w:val="16"/>
+                <w:b/>
               </w:rPr>
               <w:t>Camera-ready deadline</w:t>
             </w:r>
@@ -412,26 +227,10 @@
         </w:tc>
         <w:tc>
           <w:tcPr>
-            <w:tcW w:type="dxa" w:w="6760"/>
-            <w:vAlign w:val="center"/>
+            <w:tcW w:type="dxa" w:w="5040"/>
           </w:tcPr>
           <w:p>
-            <w:pPr>
-              <w:spacing w:after="0"/>
-            </w:pPr>
             <w:r>
-              <w:rPr>
-                <w:rFonts w:ascii="Aptos" w:hAnsi="Aptos" w:eastAsia="Aptos"/>
-                <w:sz w:val="16"/>
-              </w:rPr>
-            </w:r>
-            <w:r>
-              <w:rPr>
-                <w:rFonts w:ascii="Aptos" w:hAnsi="Aptos" w:eastAsia="Aptos"/>
-                <w:b w:val="0"/>
-                <w:color w:val="000000"/>
-                <w:sz w:val="16"/>
-              </w:rPr>
               <w:t>November 7, 2026 (tentative)</w:t>
             </w:r>
           </w:p>
@@ -440,25 +239,12 @@
       <w:tr>
         <w:tc>
           <w:tcPr>
-            <w:tcW w:type="dxa" w:w="2600"/>
-            <w:vAlign w:val="center"/>
+            <w:tcW w:type="dxa" w:w="5040"/>
           </w:tcPr>
           <w:p>
-            <w:pPr>
-              <w:spacing w:after="0"/>
-            </w:pPr>
             <w:r>
               <w:rPr>
-                <w:rFonts w:ascii="Aptos" w:hAnsi="Aptos" w:eastAsia="Aptos"/>
-                <w:sz w:val="16"/>
-              </w:rPr>
-            </w:r>
-            <w:r>
-              <w:rPr>
-                <w:rFonts w:ascii="Aptos" w:hAnsi="Aptos" w:eastAsia="Aptos"/>
-                <w:b w:val="0"/>
-                <w:color w:val="000000"/>
-                <w:sz w:val="16"/>
+                <w:b/>
               </w:rPr>
               <w:t>Event dates</w:t>
             </w:r>
@@ -466,26 +252,10 @@
         </w:tc>
         <w:tc>
           <w:tcPr>
-            <w:tcW w:type="dxa" w:w="6760"/>
-            <w:vAlign w:val="center"/>
+            <w:tcW w:type="dxa" w:w="5040"/>
           </w:tcPr>
           <w:p>
-            <w:pPr>
-              <w:spacing w:after="0"/>
-            </w:pPr>
             <w:r>
-              <w:rPr>
-                <w:rFonts w:ascii="Aptos" w:hAnsi="Aptos" w:eastAsia="Aptos"/>
-                <w:sz w:val="16"/>
-              </w:rPr>
-            </w:r>
-            <w:r>
-              <w:rPr>
-                <w:rFonts w:ascii="Aptos" w:hAnsi="Aptos" w:eastAsia="Aptos"/>
-                <w:b w:val="0"/>
-                <w:color w:val="000000"/>
-                <w:sz w:val="16"/>
-              </w:rPr>
               <w:t>December 6-7, 2026</w:t>
             </w:r>
           </w:p>
@@ -494,52 +264,23 @@
       <w:tr>
         <w:tc>
           <w:tcPr>
-            <w:tcW w:type="dxa" w:w="2600"/>
-            <w:vAlign w:val="center"/>
+            <w:tcW w:type="dxa" w:w="5040"/>
           </w:tcPr>
           <w:p>
-            <w:pPr>
-              <w:spacing w:after="0"/>
-            </w:pPr>
             <w:r>
               <w:rPr>
-                <w:rFonts w:ascii="Aptos" w:hAnsi="Aptos" w:eastAsia="Aptos"/>
-                <w:sz w:val="16"/>
+                <w:b/>
               </w:rPr>
-            </w:r>
-            <w:r>
-              <w:rPr>
-                <w:rFonts w:ascii="Aptos" w:hAnsi="Aptos" w:eastAsia="Aptos"/>
-                <w:b w:val="0"/>
-                <w:color w:val="000000"/>
-                <w:sz w:val="16"/>
-              </w:rPr>
-              <w:t>Location</w:t>
+              <w:t>Event location</w:t>
             </w:r>
           </w:p>
         </w:tc>
         <w:tc>
           <w:tcPr>
-            <w:tcW w:type="dxa" w:w="6760"/>
-            <w:vAlign w:val="center"/>
+            <w:tcW w:type="dxa" w:w="5040"/>
           </w:tcPr>
           <w:p>
-            <w:pPr>
-              <w:spacing w:after="0"/>
-            </w:pPr>
             <w:r>
-              <w:rPr>
-                <w:rFonts w:ascii="Aptos" w:hAnsi="Aptos" w:eastAsia="Aptos"/>
-                <w:sz w:val="16"/>
-              </w:rPr>
-            </w:r>
-            <w:r>
-              <w:rPr>
-                <w:rFonts w:ascii="Aptos" w:hAnsi="Aptos" w:eastAsia="Aptos"/>
-                <w:b w:val="0"/>
-                <w:color w:val="000000"/>
-                <w:sz w:val="16"/>
-              </w:rPr>
               <w:t>Sydney, Australia</w:t>
             </w:r>
           </w:p>
@@ -548,25 +289,12 @@
       <w:tr>
         <w:tc>
           <w:tcPr>
-            <w:tcW w:type="dxa" w:w="2600"/>
-            <w:vAlign w:val="center"/>
+            <w:tcW w:type="dxa" w:w="5040"/>
           </w:tcPr>
           <w:p>
-            <w:pPr>
-              <w:spacing w:after="0"/>
-            </w:pPr>
             <w:r>
               <w:rPr>
-                <w:rFonts w:ascii="Aptos" w:hAnsi="Aptos" w:eastAsia="Aptos"/>
-                <w:sz w:val="16"/>
-              </w:rPr>
-            </w:r>
-            <w:r>
-              <w:rPr>
-                <w:rFonts w:ascii="Aptos" w:hAnsi="Aptos" w:eastAsia="Aptos"/>
-                <w:b w:val="0"/>
-                <w:color w:val="000000"/>
-                <w:sz w:val="16"/>
+                <w:b/>
               </w:rPr>
               <w:t>Suggested track</w:t>
             </w:r>
@@ -574,16 +302,11 @@
         </w:tc>
         <w:tc>
           <w:tcPr>
-            <w:tcW w:type="dxa" w:w="6760"/>
-            <w:vAlign w:val="center"/>
+            <w:tcW w:type="dxa" w:w="5040"/>
           </w:tcPr>
           <w:p>
             <w:r>
-              <w:rPr>
-                <w:rFonts w:ascii="Aptos" w:hAnsi="Aptos" w:eastAsia="Aptos"/>
-                <w:sz w:val="16"/>
-              </w:rPr>
-              <w:t>Findings Track for preliminary specification-conformance work; Proceedings Track only after independent review.</w:t>
+              <w:t>Findings Track</w:t>
             </w:r>
           </w:p>
         </w:tc>
@@ -591,13 +314,12 @@
       <w:tr>
         <w:tc>
           <w:tcPr>
-            <w:tcW w:type="dxa" w:w="2600"/>
+            <w:tcW w:type="dxa" w:w="5040"/>
           </w:tcPr>
           <w:p>
             <w:r>
               <w:rPr>
-                <w:rFonts w:ascii="Aptos" w:hAnsi="Aptos" w:eastAsia="Aptos"/>
-                <w:sz w:val="16"/>
+                <w:b/>
               </w:rPr>
               <w:t>Editable paper format</w:t>
             </w:r>
@@ -605,15 +327,11 @@
         </w:tc>
         <w:tc>
           <w:tcPr>
-            <w:tcW w:type="dxa" w:w="6760"/>
+            <w:tcW w:type="dxa" w:w="5040"/>
           </w:tcPr>
           <w:p>
             <w:r>
-              <w:rPr>
-                <w:rFonts w:ascii="Aptos" w:hAnsi="Aptos" w:eastAsia="Aptos"/>
-                <w:sz w:val="16"/>
-              </w:rPr>
-              <w:t>LaTeX/Overleaf source: paper/ml4h_findings_evidence_gate.tex with paper/ml4h_findings_refs.bib; compiled PDF: paper/ml4h_findings_evidence_gate.pdf.</w:t>
+              <w:t>LaTeX/Overleaf source: paper/ml4h_findings_evidence_gate.tex and paper/ml4h_findings_refs.bib</w:t>
             </w:r>
           </w:p>
         </w:tc>
@@ -621,25 +339,20 @@
     </w:tbl>
     <w:p>
       <w:pPr>
-        <w:spacing w:after="40"/>
-      </w:pPr>
-    </w:p>
-    <w:p>
-      <w:pPr>
         <w:pStyle w:val="Heading1"/>
       </w:pPr>
       <w:r>
-        <w:t>Title and Abstract</w:t>
+        <w:t>Final Paper Title and Abstract</w:t>
       </w:r>
     </w:p>
     <w:p>
       <w:r>
-        <w:t>Title: An Executable Evidence-Gate Specification for Pharmacogenomic LLM Alerts</w:t>
+        <w:t>Title: A Deterministic Evidence Gate for Pharmacogenomic LLM Alerts: Synthetic Stress-Testing with Ablation</w:t>
       </w:r>
     </w:p>
     <w:p>
       <w:r>
-        <w:t>Abstract: LLM-generated medication alerts can sound more certain than their evidence permits. We built an executable Stage 1 specification for pharmacogenomic and genomic medication-alert text. Given structured annotations that a future live system would need to extract, the specification checks source support, population fit, and claim strength, then returns allow, narrow, abstain, or deny. Stage 1 uses author-designed synthetic cases with oracle annotations; it is a conformance and preregistration scaffold, not an end-to-end clinical system. Disabling source support, population fit, or claim strength let 2, 1, and 6 of 23 designed overclaims pass unchanged, respectively. A claim-strength-only comparator left 3/23 overclaims unchanged (PGX31-PGX33), while the full monitor routed 23/23 and preserved 10/10 bounded alerts. Arm B withheld source-support labels for PGX31-PGX33; GPT-5.6-terra matched all three deterministic actions and primary checks, while Grok-4.5 matched PGX31 and PGX32 but attributed PGX33 to claim strength. These are specification-conformance results, not clinical safety, annotation validity, generalization, or patient-benefit evidence.</w:t>
+        <w:t>Abstract: LLM-generated medication alerts can sound more certain than their evidence permits. This capstone tests a deterministic evidence gate for pharmacogenomic alert drafts using 33 author-designed synthetic cases: 23 overclaim archetypes and 10 bounded aligned alerts. The gate consumes structured annotations for source support, population fit, endpoint strength, and actionability, then returns allow, narrow, abstain, or deny. With oracle annotations, the full monitor routed 23/23 overclaims and preserved 10/10 bounded alerts; disabling source support, population fit, or claim strength let 2/23, 1/23, and 6/23 overclaims pass unchanged. Text-only extraction exposed the bottleneck: with citation fields, GPT-5.6-terra extracted 78/132 annotation fields and Grok-4.5 extracted 86/132; without citation fields, they extracted 73/132 and 70/132, while bounded-alert preservation dropped by 10 and 8 cases. These are specification-conformance and extraction-bottleneck results on synthetic cases, not clinical safety, generalization, or patient-benefit evidence.</w:t>
       </w:r>
     </w:p>
     <w:p>
@@ -647,12 +360,12 @@
         <w:pStyle w:val="Heading1"/>
       </w:pPr>
       <w:r>
-        <w:t>Generative AI Use</w:t>
+        <w:t>Generative AI Use Disclosure</w:t>
       </w:r>
     </w:p>
     <w:p>
       <w:r>
-        <w:t>Generative AI tools were used for brainstorming, critique, code scaffolding, drafting, packaging, formatting, and LLM self-evaluation baselines on synthetic annotations only. Arm A used GPT-5.6-terra and Grok-4.5 with full structured labels; Arm B used the same models on PGX31-PGX33 with source-support labels withheld, sentinel cues removed, and structured citations supplied. No real patient records, protected health information, or private genomic data were transmitted. The author selected the final scope, directed the pruning, verified sources, reviewed generated text, ran local tests, and remains responsible for all claims, limitations, and submission materials.</w:t>
+        <w:t>Generative AI tools were used for brainstorming, critique, code scaffolding, drafting, formatting, and synthetic LLM experiments. GPT-5.6-terra and Grok-4.5 were used in LLM self-evaluation and text-only extraction experiments; GPT-5.6-sol generated unlabeled held-out scenarios for later author labeling. No real patient records, protected health information, or private genomic data were used or transmitted. The author selected the final scope, verified sources, ran the code, reviewed outputs, and remains responsible for all claims and limitations.</w:t>
       </w:r>
     </w:p>
     <w:p>
@@ -666,68 +379,47 @@
     <w:p>
       <w:pPr>
         <w:pStyle w:val="ListBullet"/>
+        <w:spacing w:after="40"/>
       </w:pPr>
       <w:r>
-        <w:t>Synthetic 33-case pharmacogenomic/genomic medication-alert case bank with no real patient data, PHI, diagnosis, or treatment recommendation.</w:t>
+        <w:t>Synthetic 33-case pharmacogenomic/genomic medication-alert case bank.</w:t>
       </w:r>
     </w:p>
     <w:p>
       <w:pPr>
         <w:pStyle w:val="ListBullet"/>
+        <w:spacing w:after="40"/>
       </w:pPr>
       <w:r>
-        <w:t>Executable three-check controller with unit tests and deterministic replay outputs.</w:t>
+        <w:t>Deterministic three-check monitor with unit tests and replayable CSV/JSON outputs.</w:t>
       </w:r>
     </w:p>
     <w:p>
       <w:pPr>
         <w:pStyle w:val="ListBullet"/>
+        <w:spacing w:after="40"/>
       </w:pPr>
       <w:r>
-        <w:t>One-check ablation CSV, simple policy-comparator CSV, precedence-sensitivity CSV, Arm A/Arm B LLM self-evaluation CSV/JSON outputs, synthetic uniform-NARROW sanity outputs, and CSV/JSON summaries for overclaim handling, inappropriate denial, calibration, and check categories.</w:t>
+        <w:t>Ablation, policy-comparator, LLM self-evaluation, text-only extraction, and held-out authoring artifacts under code/ and results/.</w:t>
       </w:r>
     </w:p>
     <w:p>
       <w:pPr>
-        <w:pStyle w:val="Heading1"/>
+        <w:pStyle w:val="ListBullet"/>
+        <w:spacing w:after="40"/>
       </w:pPr>
       <w:r>
-        <w:t>Evidence-Boundary Framework</w:t>
-      </w:r>
-    </w:p>
-    <w:p>
-      <w:r>
-        <w:t>The empirical workflow is pharmacogenomics, but the design pattern is broader: source support asks whether evidence exists and applies; population fit asks whether evidence transports to the target patient or population; and claim strength asks whether the evidence supports the displayed action rather than only a weaker association or surrogate endpoint.</w:t>
+        <w:t>Safety boundary: no diagnosis, no treatment recommendation, no real patient data, and no protected health information.</w:t>
       </w:r>
     </w:p>
     <w:sectPr>
-      <w:footerReference w:type="default" r:id="rId9"/>
       <w:pgSz w:w="12240" w:h="15840"/>
-      <w:pgMar w:top="1152" w:right="1224" w:bottom="1080" w:left="1224" w:header="648" w:footer="504" w:gutter="0"/>
+      <w:pgMar w:top="1080" w:right="1080" w:bottom="1080" w:left="1080" w:header="720" w:footer="720" w:gutter="0"/>
       <w:cols w:space="720"/>
       <w:docGrid w:linePitch="360"/>
     </w:sectPr>
   </w:body>
 </w:document>
-</file>
-
-<file path=word/footer1.xml><?xml version="1.0" encoding="utf-8"?>
-<w:ftr xmlns:m="http://schemas.openxmlformats.org/officeDocument/2006/math" xmlns:mc="http://schemas.openxmlformats.org/markup-compatibility/2006" xmlns:mo="http://schemas.microsoft.com/office/mac/office/2008/main" xmlns:mv="urn:schemas-microsoft-com:mac:vml" xmlns:o="urn:schemas-microsoft-com:office:office" xmlns:r="http://schemas.openxmlformats.org/officeDocument/2006/relationships" xmlns:v="urn:schemas-microsoft-com:vml" xmlns:w10="urn:schemas-microsoft-com:office:word" xmlns:w14="http://schemas.microsoft.com/office/word/2010/wordml" xmlns:w="http://schemas.openxmlformats.org/wordprocessingml/2006/main" xmlns:wne="http://schemas.microsoft.com/office/word/2006/wordml" xmlns:wp14="http://schemas.microsoft.com/office/word/2010/wordprocessingDrawing" xmlns:wp="http://schemas.openxmlformats.org/drawingml/2006/wordprocessingDrawing" xmlns:wpc="http://schemas.microsoft.com/office/word/2010/wordprocessingCanvas" xmlns:wpg="http://schemas.microsoft.com/office/word/2010/wordprocessingGroup" xmlns:wpi="http://schemas.microsoft.com/office/word/2010/wordprocessingInk" xmlns:wps="http://schemas.microsoft.com/office/word/2010/wordprocessingShape" mc:Ignorable="w14 wp14">
-  <w:p>
-    <w:pPr>
-      <w:pStyle w:val="Footer"/>
-      <w:jc w:val="center"/>
-    </w:pPr>
-    <w:r>
-      <w:rPr>
-        <w:rFonts w:ascii="Calibri" w:hAnsi="Calibri"/>
-        <w:color w:val="555555"/>
-        <w:sz w:val="17"/>
-      </w:rPr>
-      <w:t>Ravi Bajaj - Summary Sheet - August 8, 2026</w:t>
-    </w:r>
-  </w:p>
-</w:ftr>
 </file>
 
 <file path=word/numbering.xml><?xml version="1.0" encoding="utf-8"?>
@@ -1094,7 +786,7 @@
     <w:qFormat/>
     <w:rsid w:val="00FC693F"/>
     <w:pPr>
-      <w:spacing w:after="120" w:line="269" w:lineRule="auto"/>
+      <w:spacing w:after="100" w:line="259" w:lineRule="auto"/>
     </w:pPr>
     <w:rPr>
       <w:rFonts w:ascii="Calibri" w:hAnsi="Calibri"/>
@@ -1156,7 +848,7 @@
     <w:pPr>
       <w:keepNext/>
       <w:keepLines/>
-      <w:spacing w:before="200" w:after="80"/>
+      <w:spacing w:before="160" w:after="80"/>
       <w:outlineLvl w:val="0"/>
     </w:pPr>
     <w:rPr>
@@ -1164,7 +856,7 @@
       <w:b/>
       <w:bCs/>
       <w:color w:val="2E74B5"/>
-      <w:sz w:val="32"/>
+      <w:sz w:val="30"/>
       <w:szCs w:val="28"/>
     </w:rPr>
   </w:style>
@@ -1180,7 +872,7 @@
     <w:pPr>
       <w:keepNext/>
       <w:keepLines/>
-      <w:spacing w:before="200" w:after="80"/>
+      <w:spacing w:before="100" w:after="80"/>
       <w:outlineLvl w:val="1"/>
     </w:pPr>
     <w:rPr>
@@ -1188,7 +880,7 @@
       <w:b/>
       <w:bCs/>
       <w:color w:val="2E74B5"/>
-      <w:sz w:val="26"/>
+      <w:sz w:val="24"/>
       <w:szCs w:val="26"/>
     </w:rPr>
   </w:style>
@@ -1204,15 +896,15 @@
     <w:pPr>
       <w:keepNext/>
       <w:keepLines/>
-      <w:spacing w:before="200" w:after="80"/>
+      <w:spacing w:before="100" w:after="80"/>
       <w:outlineLvl w:val="2"/>
     </w:pPr>
     <w:rPr>
       <w:rFonts w:asciiTheme="majorHAnsi" w:eastAsiaTheme="majorEastAsia" w:hAnsiTheme="majorHAnsi" w:cstheme="majorBidi" w:ascii="Calibri" w:hAnsi="Calibri"/>
       <w:b/>
       <w:bCs/>
-      <w:color w:val="1F4D78"/>
-      <w:sz w:val="23"/>
+      <w:color w:val="2E74B5"/>
+      <w:sz w:val="22"/>
     </w:rPr>
   </w:style>
   <w:style w:type="paragraph" w:styleId="Heading4">

</xml_diff>

<commit_message>
Distinguish extraction failure regimes
</commit_message>
<xml_diff>
--- a/summary/Module_14_Summary_Sheet_Pruned_Evidence_Gate_Ravi_Bajaj.docx
+++ b/summary/Module_14_Summary_Sheet_Pruned_Evidence_Gate_Ravi_Bajaj.docx
@@ -352,7 +352,7 @@
     </w:p>
     <w:p>
       <w:r>
-        <w:t>Abstract: LLM-generated medication alerts can sound more certain than their evidence permits. This capstone tests a deterministic evidence gate for pharmacogenomic alert drafts using 33 author-designed synthetic cases: 23 overclaim archetypes and 10 bounded aligned alerts. The gate consumes structured annotations for source support, population fit, endpoint strength, and actionability, then returns allow, narrow, abstain, or deny. With oracle annotations, the full monitor routed 23/23 overclaims and preserved 10/10 bounded alerts; disabling source support, population fit, or claim strength let 2/23, 1/23, and 6/23 overclaims pass unchanged. Text-only extraction exposed the bottleneck: with citation fields, GPT-5.6-terra extracted 78/132 annotation fields and Grok-4.5 extracted 86/132; without citation fields, they extracted 73/132 and 70/132, while bounded-alert preservation dropped by 10 and 8 cases. These are specification-conformance and extraction-bottleneck results on synthetic cases, not clinical safety, generalization, or patient-benefit evidence.</w:t>
+        <w:t>Abstract: LLM-generated medication alerts can sound more certain than their evidence permits. This capstone tests a deterministic evidence gate for pharmacogenomic alert drafts using 33 author-designed synthetic cases: 23 overclaim archetypes and 10 bounded aligned alerts. The gate consumes structured annotations for source support, population fit, endpoint strength, and actionability, then returns allow, narrow, abstain, or deny. With oracle annotations, the full monitor routed 23/23 overclaims and preserved 10/10 bounded alerts. With citation fields, GPT-5.6-terra and Grok-4.5 each matched 21/33 downstream actions, while preserving 4/10 and 9/10 bounded alerts. Without citation fields, downstream action agreement was 11/33 and 12/33, with 0/10 and 2/10 bounded alerts preserved. Disabling source support, population fit, or claim strength let 2/23, 1/23, and 6/23 overclaims pass unchanged. These are specification-conformance and extraction-bottleneck results on synthetic cases, not clinical safety, generalization, or patient-benefit evidence.</w:t>
       </w:r>
     </w:p>
     <w:p>
@@ -365,7 +365,7 @@
     </w:p>
     <w:p>
       <w:r>
-        <w:t>Generative AI tools were used for brainstorming, critique, code scaffolding, drafting, formatting, and synthetic LLM experiments. GPT-5.6-terra and Grok-4.5 were used in LLM self-evaluation and text-only extraction experiments; GPT-5.6-sol generated unlabeled held-out scenarios for later author labeling. No real patient records, protected health information, or private genomic data were used or transmitted. The author selected the final scope, verified sources, ran the code, reviewed outputs, and remains responsible for all claims and limitations.</w:t>
+        <w:t>Generative AI tools were used for brainstorming, critique, code scaffolding, drafting, formatting, and synthetic LLM experiments. GPT-5.6-terra and Grok-4.5 were used in structured-label translation and text-only extraction experiments; GPT-5.6-sol generated unlabeled held-out scenarios for later author labeling. No real patient records, protected health information, or private genomic data were used or transmitted. The author selected the final scope, verified sources, ran the code, reviewed outputs, and remains responsible for all claims and limitations.</w:t>
       </w:r>
     </w:p>
     <w:p>
@@ -400,7 +400,7 @@
         <w:spacing w:after="40"/>
       </w:pPr>
       <w:r>
-        <w:t>Ablation, policy-comparator, LLM self-evaluation, text-only extraction, and held-out authoring artifacts under code/ and results/.</w:t>
+        <w:t>Ablation, policy-comparator, structured-label translation, text-only extraction, derived directional-error/PRF, and held-out authoring artifacts under code/ and results/.</w:t>
       </w:r>
     </w:p>
     <w:p>

</xml_diff>